<commit_message>
Update English name to Eayon
</commit_message>
<xml_diff>
--- a/public/田一雄_高级数字化产品经理_中文简历.docx
+++ b/public/田一雄_高级数字化产品经理_中文简历.docx
@@ -29,7 +29,7 @@
           <w:color w:val="102A43"/>
           <w:sz w:val="62"/>
         </w:rPr>
-        <w:t>田一雄</w:t>
+        <w:t>田一雄 / Eayon</w:t>
       </w:r>
     </w:p>
     <w:p>
@@ -1151,7 +1151,7 @@
         <w:color w:val="64748B"/>
         <w:sz w:val="16"/>
       </w:rPr>
-      <w:t>田一雄</w:t>
+      <w:t>田一雄 / Eayon</w:t>
     </w:r>
     <w:r>
       <w:tab/>

</xml_diff>